<commit_message>
fix: logos nitidos y sin traslape en la portada formemp
Los banners eran imagenes de 159x67 px estiradas a 130 pt y pisaban
el renglon de la universidad. Se rehicieron en alta resolucion con los
escudos de portada-fime y se subieron arriba del titulo.

Co-Authored-By: Claude Opus 5.5 <noreply@anthropic.com>
</commit_message>
<xml_diff>
--- a/plantillas/portada-formemp.docx
+++ b/plantillas/portada-formemp.docx
@@ -25,12 +25,12 @@
           <wp:anchor distT="0" distB="0" distL="114300" distR="114300" simplePos="0" relativeHeight="251658240" behindDoc="1" locked="0" layoutInCell="1" allowOverlap="1" wp14:anchorId="50D9E0BC" wp14:editId="1FDF8ECA">
             <wp:simplePos x="0" y="0"/>
             <wp:positionH relativeFrom="column">
-              <wp:posOffset>4514850</wp:posOffset>
+              <wp:posOffset>4652010</wp:posOffset>
             </wp:positionH>
             <wp:positionV relativeFrom="paragraph">
-              <wp:posOffset>-104775</wp:posOffset>
+              <wp:posOffset>-508000</wp:posOffset>
             </wp:positionV>
-            <wp:extent cx="1645858" cy="693538"/>
+            <wp:extent cx="1587500" cy="547708"/>
             <wp:effectExtent l="0" t="0" r="0" b="0"/>
             <wp:wrapNone/>
             <wp:docPr id="2050113801" name="drawing"/>
@@ -59,7 +59,7 @@
                   <pic:spPr>
                     <a:xfrm>
                       <a:off x="0" y="0"/>
-                      <a:ext cx="1645858" cy="693538"/>
+                      <a:ext cx="1587500" cy="547708"/>
                     </a:xfrm>
                     <a:prstGeom prst="rect">
                       <a:avLst/>
@@ -85,12 +85,12 @@
           <wp:anchor distT="0" distB="0" distL="114300" distR="114300" simplePos="0" relativeHeight="251658241" behindDoc="1" locked="0" layoutInCell="1" allowOverlap="1" wp14:anchorId="710A254D" wp14:editId="71783C08">
             <wp:simplePos x="0" y="0"/>
             <wp:positionH relativeFrom="column">
-              <wp:posOffset>-419100</wp:posOffset>
+              <wp:posOffset>-508000</wp:posOffset>
             </wp:positionH>
             <wp:positionV relativeFrom="paragraph">
-              <wp:posOffset>-152400</wp:posOffset>
+              <wp:posOffset>-508000</wp:posOffset>
             </wp:positionV>
-            <wp:extent cx="1682055" cy="714598"/>
+            <wp:extent cx="1587500" cy="586605"/>
             <wp:effectExtent l="0" t="0" r="0" b="0"/>
             <wp:wrapNone/>
             <wp:docPr id="2095994137" name="drawing"/>
@@ -119,7 +119,7 @@
                   <pic:spPr>
                     <a:xfrm>
                       <a:off x="0" y="0"/>
-                      <a:ext cx="1682055" cy="714598"/>
+                      <a:ext cx="1587500" cy="586605"/>
                     </a:xfrm>
                     <a:prstGeom prst="rect">
                       <a:avLst/>

</xml_diff>